<commit_message>
Fix: Uncatalogued error, Smart Suffix, Default Sort ASC
</commit_message>
<xml_diff>
--- a/Testes de Homolog/Correções Cash.docx
+++ b/Testes de Homolog/Correções Cash.docx
@@ -64,6 +64,20 @@
     </w:p>
     <w:p/>
     <w:p>
+      <w:pPr>
+        <w:rPr>
+          <w:color w:val="4C94D8" w:themeColor="text2" w:themeTint="80"/>
+        </w:rPr>
+      </w:pPr>
+      <w:r>
+        <w:rPr>
+          <w:color w:val="4C94D8" w:themeColor="text2" w:themeTint="80"/>
+        </w:rPr>
+        <w:t>Corrigido</w:t>
+      </w:r>
+    </w:p>
+    <w:p/>
+    <w:p>
       <w:r>
         <w:t>FEATURE 1)</w:t>
       </w:r>
@@ -81,11 +95,10 @@
         <w:rPr>
           <w:noProof/>
         </w:rPr>
-        <w:lastRenderedPageBreak/>
         <w:drawing>
-          <wp:inline distT="0" distB="0" distL="0" distR="0" wp14:anchorId="6B68636E" wp14:editId="4A0E2C7E">
-            <wp:extent cx="5400040" cy="3970655"/>
-            <wp:effectExtent l="0" t="0" r="0" b="0"/>
+          <wp:inline distT="0" distB="0" distL="0" distR="0" wp14:anchorId="6B68636E" wp14:editId="6F93A7B9">
+            <wp:extent cx="3626659" cy="2666686"/>
+            <wp:effectExtent l="0" t="0" r="0" b="635"/>
             <wp:docPr id="1254812818" name="Imagem 1"/>
             <wp:cNvGraphicFramePr>
               <a:graphicFrameLocks xmlns:a="http://schemas.openxmlformats.org/drawingml/2006/main" noChangeAspect="1"/>
@@ -106,7 +119,7 @@
                   <pic:spPr>
                     <a:xfrm>
                       <a:off x="0" y="0"/>
-                      <a:ext cx="5400040" cy="3970655"/>
+                      <a:ext cx="3636796" cy="2674140"/>
                     </a:xfrm>
                     <a:prstGeom prst="rect">
                       <a:avLst/>
@@ -117,6 +130,27 @@
             </a:graphic>
           </wp:inline>
         </w:drawing>
+      </w:r>
+    </w:p>
+    <w:p>
+      <w:r>
+        <w:rPr>
+          <w:color w:val="4C94D8" w:themeColor="text2" w:themeTint="80"/>
+        </w:rPr>
+        <w:lastRenderedPageBreak/>
+        <w:t xml:space="preserve">Desenvolvido filtro de coluna </w:t>
+      </w:r>
+      <w:r>
+        <w:rPr>
+          <w:color w:val="4C94D8" w:themeColor="text2" w:themeTint="80"/>
+        </w:rPr>
+        <w:t>igual a (vazias) permitindo filtrar qualquer campo com aquele dado sem ter sido preenchido. Com isso, poderemos fazer filtros mais elaborados, inclusive, permitindo mais de um filtro nas tabelas</w:t>
+      </w:r>
+      <w:r>
+        <w:rPr>
+          <w:color w:val="4C94D8" w:themeColor="text2" w:themeTint="80"/>
+        </w:rPr>
+        <w:t xml:space="preserve"> (ex: pagamentos de Jan/2026 E data real = (vazias))</w:t>
       </w:r>
     </w:p>
     <w:p/>
@@ -181,7 +215,6 @@
         <w:rPr>
           <w:noProof/>
         </w:rPr>
-        <w:lastRenderedPageBreak/>
         <w:drawing>
           <wp:inline distT="0" distB="0" distL="0" distR="0" wp14:anchorId="55E126B2" wp14:editId="19E22D62">
             <wp:extent cx="5400040" cy="2919095"/>
@@ -223,6 +256,20 @@
     <w:p>
       <w:r>
         <w:t>Se colocar a data real de hoje, funciona, mas não consigo alterar.</w:t>
+      </w:r>
+    </w:p>
+    <w:p>
+      <w:r>
+        <w:rPr>
+          <w:color w:val="4C94D8" w:themeColor="text2" w:themeTint="80"/>
+        </w:rPr>
+        <w:t xml:space="preserve">Parece ser proteção conta alterações acima de N dias sendo que isso é configurado na tela de Parâmetros do sistema. </w:t>
+      </w:r>
+      <w:r>
+        <w:rPr>
+          <w:color w:val="4C94D8" w:themeColor="text2" w:themeTint="80"/>
+        </w:rPr>
+        <w:t>Estou melhorando a mensagem de erro quando o usuário tenta alterar data real fora do intervalo permitido para que fique claro para o usuário qual o problema que está impedindo que a gravação seja feita</w:t>
       </w:r>
     </w:p>
     <w:p/>
@@ -283,6 +330,33 @@
         </w:drawing>
       </w:r>
     </w:p>
+    <w:p>
+      <w:r>
+        <w:rPr>
+          <w:color w:val="4C94D8" w:themeColor="text2" w:themeTint="80"/>
+        </w:rPr>
+        <w:t xml:space="preserve">Neste caso, a configuração dos filtros estava filtrando todas as linhas da estrutura de tipos. Eu entrei nesta imagem de engrenagem no canto superior direito “Config/Filtros” e corrigi os filtros e a tela funcionou corretamente. A </w:t>
+      </w:r>
+      <w:r>
+        <w:rPr>
+          <w:color w:val="4C94D8" w:themeColor="text2" w:themeTint="80"/>
+        </w:rPr>
+        <w:t>princípio</w:t>
+      </w:r>
+      <w:r>
+        <w:rPr>
+          <w:color w:val="4C94D8" w:themeColor="text2" w:themeTint="80"/>
+        </w:rPr>
+        <w:t xml:space="preserve"> não me pareceu ser nenhum bug. Mas </w:t>
+      </w:r>
+      <w:r>
+        <w:rPr>
+          <w:color w:val="4C94D8" w:themeColor="text2" w:themeTint="80"/>
+        </w:rPr>
+        <w:t>tenho que monitorar para ver se o sistema está desmarcando os itens da árvore fazendo com que este campo fique vazio</w:t>
+      </w:r>
+    </w:p>
+    <w:p/>
     <w:sectPr>
       <w:pgSz w:w="11906" w:h="16838"/>
       <w:pgMar w:top="1417" w:right="1701" w:bottom="1417" w:left="1701" w:header="708" w:footer="708" w:gutter="0"/>

</xml_diff>